<commit_message>
Lab#1: install venv; add default code
</commit_message>
<xml_diff>
--- a/Lab_1/Lab_1_Gavriloff_VTm_126.docx
+++ b/Lab_1/Lab_1_Gavriloff_VTm_126.docx
@@ -409,16 +409,7 @@
           <w:sz w:val="28"/>
           <w:szCs w:val="28"/>
         </w:rPr>
-        <w:t>Лабораторная работа №</w:t>
-      </w:r>
-      <w:r>
-        <w:rPr>
-          <w:rFonts w:cs="Times New Roman" w:ascii="Times New Roman" w:hAnsi="Times New Roman"/>
-          <w:b/>
-          <w:sz w:val="28"/>
-          <w:szCs w:val="28"/>
-        </w:rPr>
-        <w:t>1</w:t>
+        <w:t>Лабораторная работа №1</w:t>
       </w:r>
     </w:p>
     <w:p>
@@ -750,6 +741,54 @@
         <w:rPr/>
       </w:pPr>
       <w:r>
+        <w:drawing>
+          <wp:anchor behindDoc="0" distT="0" distB="0" distL="0" distR="0" simplePos="0" locked="0" layoutInCell="0" allowOverlap="1" relativeHeight="2">
+            <wp:simplePos x="0" y="0"/>
+            <wp:positionH relativeFrom="column">
+              <wp:posOffset>0</wp:posOffset>
+            </wp:positionH>
+            <wp:positionV relativeFrom="paragraph">
+              <wp:posOffset>409575</wp:posOffset>
+            </wp:positionV>
+            <wp:extent cx="5940425" cy="1724660"/>
+            <wp:effectExtent l="0" t="0" r="0" b="0"/>
+            <wp:wrapTopAndBottom/>
+            <wp:docPr id="1" name="Изображение1" descr="" title=""/>
+            <wp:cNvGraphicFramePr>
+              <a:graphicFrameLocks xmlns:a="http://schemas.openxmlformats.org/drawingml/2006/main" noChangeAspect="1"/>
+            </wp:cNvGraphicFramePr>
+            <a:graphic xmlns:a="http://schemas.openxmlformats.org/drawingml/2006/main">
+              <a:graphicData uri="http://schemas.openxmlformats.org/drawingml/2006/picture">
+                <pic:pic xmlns:pic="http://schemas.openxmlformats.org/drawingml/2006/picture">
+                  <pic:nvPicPr>
+                    <pic:cNvPr id="1" name="Изображение1" descr="" title=""/>
+                    <pic:cNvPicPr>
+                      <a:picLocks noChangeAspect="1" noChangeArrowheads="1"/>
+                    </pic:cNvPicPr>
+                  </pic:nvPicPr>
+                  <pic:blipFill>
+                    <a:blip r:embed="rId2"/>
+                    <a:stretch>
+                      <a:fillRect/>
+                    </a:stretch>
+                  </pic:blipFill>
+                  <pic:spPr bwMode="auto">
+                    <a:xfrm>
+                      <a:off x="0" y="0"/>
+                      <a:ext cx="5940425" cy="1724660"/>
+                    </a:xfrm>
+                    <a:prstGeom prst="rect">
+                      <a:avLst/>
+                    </a:prstGeom>
+                    <a:noFill/>
+                  </pic:spPr>
+                </pic:pic>
+              </a:graphicData>
+            </a:graphic>
+          </wp:anchor>
+        </w:drawing>
+      </w:r>
+      <w:r>
         <w:rPr/>
         <w:t>ddd</w:t>
       </w:r>
@@ -768,6 +807,192 @@
       <w:pPr>
         <w:pStyle w:val="Style16"/>
         <w:bidi w:val="0"/>
+        <w:rPr/>
+      </w:pPr>
+      <w:r>
+        <w:rPr/>
+        <w:t>d</w:t>
+      </w:r>
+    </w:p>
+    <w:p>
+      <w:pPr>
+        <w:pStyle w:val="Style16"/>
+        <w:bidi w:val="0"/>
+        <w:rPr/>
+      </w:pPr>
+      <w:r>
+        <w:rPr/>
+        <w:drawing>
+          <wp:anchor behindDoc="0" distT="0" distB="0" distL="0" distR="0" simplePos="0" locked="0" layoutInCell="0" allowOverlap="1" relativeHeight="3">
+            <wp:simplePos x="0" y="0"/>
+            <wp:positionH relativeFrom="column">
+              <wp:align>center</wp:align>
+            </wp:positionH>
+            <wp:positionV relativeFrom="paragraph">
+              <wp:posOffset>635</wp:posOffset>
+            </wp:positionV>
+            <wp:extent cx="5940425" cy="2528570"/>
+            <wp:effectExtent l="0" t="0" r="0" b="0"/>
+            <wp:wrapTopAndBottom/>
+            <wp:docPr id="2" name="Изображение2" descr="" title=""/>
+            <wp:cNvGraphicFramePr>
+              <a:graphicFrameLocks xmlns:a="http://schemas.openxmlformats.org/drawingml/2006/main" noChangeAspect="1"/>
+            </wp:cNvGraphicFramePr>
+            <a:graphic xmlns:a="http://schemas.openxmlformats.org/drawingml/2006/main">
+              <a:graphicData uri="http://schemas.openxmlformats.org/drawingml/2006/picture">
+                <pic:pic xmlns:pic="http://schemas.openxmlformats.org/drawingml/2006/picture">
+                  <pic:nvPicPr>
+                    <pic:cNvPr id="2" name="Изображение2" descr="" title=""/>
+                    <pic:cNvPicPr>
+                      <a:picLocks noChangeAspect="1" noChangeArrowheads="1"/>
+                    </pic:cNvPicPr>
+                  </pic:nvPicPr>
+                  <pic:blipFill>
+                    <a:blip r:embed="rId3"/>
+                    <a:stretch>
+                      <a:fillRect/>
+                    </a:stretch>
+                  </pic:blipFill>
+                  <pic:spPr bwMode="auto">
+                    <a:xfrm>
+                      <a:off x="0" y="0"/>
+                      <a:ext cx="5940425" cy="2528570"/>
+                    </a:xfrm>
+                    <a:prstGeom prst="rect">
+                      <a:avLst/>
+                    </a:prstGeom>
+                    <a:noFill/>
+                  </pic:spPr>
+                </pic:pic>
+              </a:graphicData>
+            </a:graphic>
+          </wp:anchor>
+        </w:drawing>
+      </w:r>
+    </w:p>
+    <w:p>
+      <w:pPr>
+        <w:pStyle w:val="Style16"/>
+        <w:bidi w:val="0"/>
+        <w:ind w:hanging="0"/>
+        <w:jc w:val="center"/>
+        <w:rPr>
+          <w:b w:val="false"/>
+          <w:bCs w:val="false"/>
+        </w:rPr>
+      </w:pPr>
+      <w:r>
+        <w:rPr>
+          <w:b w:val="false"/>
+          <w:bCs w:val="false"/>
+        </w:rPr>
+        <w:t>ddd</w:t>
+      </w:r>
+    </w:p>
+    <w:p>
+      <w:pPr>
+        <w:pStyle w:val="Style16"/>
+        <w:bidi w:val="0"/>
+        <w:ind w:hanging="0"/>
+        <w:jc w:val="center"/>
+        <w:rPr>
+          <w:b w:val="false"/>
+          <w:bCs w:val="false"/>
+        </w:rPr>
+      </w:pPr>
+      <w:r>
+        <w:rPr>
+          <w:b w:val="false"/>
+          <w:bCs w:val="false"/>
+        </w:rPr>
+        <w:drawing>
+          <wp:anchor behindDoc="0" distT="0" distB="0" distL="0" distR="0" simplePos="0" locked="0" layoutInCell="0" allowOverlap="1" relativeHeight="4">
+            <wp:simplePos x="0" y="0"/>
+            <wp:positionH relativeFrom="column">
+              <wp:align>center</wp:align>
+            </wp:positionH>
+            <wp:positionV relativeFrom="paragraph">
+              <wp:posOffset>635</wp:posOffset>
+            </wp:positionV>
+            <wp:extent cx="5940425" cy="1487170"/>
+            <wp:effectExtent l="0" t="0" r="0" b="0"/>
+            <wp:wrapTopAndBottom/>
+            <wp:docPr id="3" name="Изображение3" descr="" title=""/>
+            <wp:cNvGraphicFramePr>
+              <a:graphicFrameLocks xmlns:a="http://schemas.openxmlformats.org/drawingml/2006/main" noChangeAspect="1"/>
+            </wp:cNvGraphicFramePr>
+            <a:graphic xmlns:a="http://schemas.openxmlformats.org/drawingml/2006/main">
+              <a:graphicData uri="http://schemas.openxmlformats.org/drawingml/2006/picture">
+                <pic:pic xmlns:pic="http://schemas.openxmlformats.org/drawingml/2006/picture">
+                  <pic:nvPicPr>
+                    <pic:cNvPr id="3" name="Изображение3" descr="" title=""/>
+                    <pic:cNvPicPr>
+                      <a:picLocks noChangeAspect="1" noChangeArrowheads="1"/>
+                    </pic:cNvPicPr>
+                  </pic:nvPicPr>
+                  <pic:blipFill>
+                    <a:blip r:embed="rId4"/>
+                    <a:stretch>
+                      <a:fillRect/>
+                    </a:stretch>
+                  </pic:blipFill>
+                  <pic:spPr bwMode="auto">
+                    <a:xfrm>
+                      <a:off x="0" y="0"/>
+                      <a:ext cx="5940425" cy="1487170"/>
+                    </a:xfrm>
+                    <a:prstGeom prst="rect">
+                      <a:avLst/>
+                    </a:prstGeom>
+                    <a:noFill/>
+                  </pic:spPr>
+                </pic:pic>
+              </a:graphicData>
+            </a:graphic>
+          </wp:anchor>
+        </w:drawing>
+      </w:r>
+    </w:p>
+    <w:p>
+      <w:pPr>
+        <w:pStyle w:val="Style16"/>
+        <w:bidi w:val="0"/>
+        <w:ind w:hanging="0"/>
+        <w:jc w:val="center"/>
+        <w:rPr>
+          <w:b w:val="false"/>
+          <w:bCs w:val="false"/>
+        </w:rPr>
+      </w:pPr>
+      <w:r>
+        <w:rPr>
+          <w:b w:val="false"/>
+          <w:bCs w:val="false"/>
+        </w:rPr>
+      </w:r>
+    </w:p>
+    <w:p>
+      <w:pPr>
+        <w:pStyle w:val="Style16"/>
+        <w:bidi w:val="0"/>
+        <w:ind w:hanging="0"/>
+        <w:jc w:val="center"/>
+        <w:rPr>
+          <w:b w:val="false"/>
+          <w:bCs w:val="false"/>
+        </w:rPr>
+      </w:pPr>
+      <w:r>
+        <w:rPr>
+          <w:b w:val="false"/>
+          <w:bCs w:val="false"/>
+        </w:rPr>
+      </w:r>
+    </w:p>
+    <w:p>
+      <w:pPr>
+        <w:pStyle w:val="Style16"/>
+        <w:bidi w:val="0"/>
         <w:ind w:hanging="0"/>
         <w:jc w:val="center"/>
         <w:rPr>
@@ -910,9 +1135,9 @@
       </w:r>
     </w:p>
     <w:sectPr>
-      <w:footerReference w:type="even" r:id="rId2"/>
-      <w:footerReference w:type="default" r:id="rId3"/>
-      <w:footerReference w:type="first" r:id="rId4"/>
+      <w:footerReference w:type="even" r:id="rId5"/>
+      <w:footerReference w:type="default" r:id="rId6"/>
+      <w:footerReference w:type="first" r:id="rId7"/>
       <w:type w:val="nextPage"/>
       <w:pgSz w:w="11906" w:h="16838"/>
       <w:pgMar w:left="1701" w:right="850" w:gutter="0" w:header="0" w:top="1134" w:footer="708" w:bottom="1134"/>
@@ -991,7 +1216,7 @@
             <w:szCs w:val="24"/>
             <w:rFonts w:cs="Times New Roman" w:ascii="Times New Roman" w:hAnsi="Times New Roman"/>
           </w:rPr>
-          <w:t>2</w:t>
+          <w:t>3</w:t>
         </w:r>
         <w:r>
           <w:rPr>
@@ -1070,7 +1295,7 @@
             <w:szCs w:val="24"/>
             <w:rFonts w:cs="Times New Roman" w:ascii="Times New Roman" w:hAnsi="Times New Roman"/>
           </w:rPr>
-          <w:t>2</w:t>
+          <w:t>3</w:t>
         </w:r>
         <w:r>
           <w:rPr>

</xml_diff>

<commit_message>
Lab#1:refactoring main.py - create classes Work,WorkFactory; install pyqt6 in requirements
</commit_message>
<xml_diff>
--- a/Lab_1/Lab_1_Gavriloff_VTm_126.docx
+++ b/Lab_1/Lab_1_Gavriloff_VTm_126.docx
@@ -969,6 +969,52 @@
           <w:b w:val="false"/>
           <w:bCs w:val="false"/>
         </w:rPr>
+        <w:drawing>
+          <wp:anchor behindDoc="0" distT="0" distB="0" distL="0" distR="0" simplePos="0" locked="0" layoutInCell="0" allowOverlap="1" relativeHeight="5">
+            <wp:simplePos x="0" y="0"/>
+            <wp:positionH relativeFrom="column">
+              <wp:align>center</wp:align>
+            </wp:positionH>
+            <wp:positionV relativeFrom="paragraph">
+              <wp:posOffset>635</wp:posOffset>
+            </wp:positionV>
+            <wp:extent cx="5940425" cy="832485"/>
+            <wp:effectExtent l="0" t="0" r="0" b="0"/>
+            <wp:wrapTopAndBottom/>
+            <wp:docPr id="4" name="Изображение4" descr="" title=""/>
+            <wp:cNvGraphicFramePr>
+              <a:graphicFrameLocks xmlns:a="http://schemas.openxmlformats.org/drawingml/2006/main" noChangeAspect="1"/>
+            </wp:cNvGraphicFramePr>
+            <a:graphic xmlns:a="http://schemas.openxmlformats.org/drawingml/2006/main">
+              <a:graphicData uri="http://schemas.openxmlformats.org/drawingml/2006/picture">
+                <pic:pic xmlns:pic="http://schemas.openxmlformats.org/drawingml/2006/picture">
+                  <pic:nvPicPr>
+                    <pic:cNvPr id="4" name="Изображение4" descr="" title=""/>
+                    <pic:cNvPicPr>
+                      <a:picLocks noChangeAspect="1" noChangeArrowheads="1"/>
+                    </pic:cNvPicPr>
+                  </pic:nvPicPr>
+                  <pic:blipFill>
+                    <a:blip r:embed="rId5"/>
+                    <a:stretch>
+                      <a:fillRect/>
+                    </a:stretch>
+                  </pic:blipFill>
+                  <pic:spPr bwMode="auto">
+                    <a:xfrm>
+                      <a:off x="0" y="0"/>
+                      <a:ext cx="5940425" cy="832485"/>
+                    </a:xfrm>
+                    <a:prstGeom prst="rect">
+                      <a:avLst/>
+                    </a:prstGeom>
+                    <a:noFill/>
+                  </pic:spPr>
+                </pic:pic>
+              </a:graphicData>
+            </a:graphic>
+          </wp:anchor>
+        </w:drawing>
       </w:r>
     </w:p>
     <w:p>
@@ -987,6 +1033,179 @@
           <w:b w:val="false"/>
           <w:bCs w:val="false"/>
         </w:rPr>
+        <w:drawing>
+          <wp:anchor behindDoc="0" distT="0" distB="0" distL="0" distR="0" simplePos="0" locked="0" layoutInCell="0" allowOverlap="1" relativeHeight="6">
+            <wp:simplePos x="0" y="0"/>
+            <wp:positionH relativeFrom="column">
+              <wp:align>center</wp:align>
+            </wp:positionH>
+            <wp:positionV relativeFrom="paragraph">
+              <wp:posOffset>635</wp:posOffset>
+            </wp:positionV>
+            <wp:extent cx="5409565" cy="2592070"/>
+            <wp:effectExtent l="0" t="0" r="0" b="0"/>
+            <wp:wrapTopAndBottom/>
+            <wp:docPr id="5" name="Изображение5" descr="" title=""/>
+            <wp:cNvGraphicFramePr>
+              <a:graphicFrameLocks xmlns:a="http://schemas.openxmlformats.org/drawingml/2006/main" noChangeAspect="1"/>
+            </wp:cNvGraphicFramePr>
+            <a:graphic xmlns:a="http://schemas.openxmlformats.org/drawingml/2006/main">
+              <a:graphicData uri="http://schemas.openxmlformats.org/drawingml/2006/picture">
+                <pic:pic xmlns:pic="http://schemas.openxmlformats.org/drawingml/2006/picture">
+                  <pic:nvPicPr>
+                    <pic:cNvPr id="5" name="Изображение5" descr="" title=""/>
+                    <pic:cNvPicPr>
+                      <a:picLocks noChangeAspect="1" noChangeArrowheads="1"/>
+                    </pic:cNvPicPr>
+                  </pic:nvPicPr>
+                  <pic:blipFill>
+                    <a:blip r:embed="rId6"/>
+                    <a:stretch>
+                      <a:fillRect/>
+                    </a:stretch>
+                  </pic:blipFill>
+                  <pic:spPr bwMode="auto">
+                    <a:xfrm>
+                      <a:off x="0" y="0"/>
+                      <a:ext cx="5409565" cy="2592070"/>
+                    </a:xfrm>
+                    <a:prstGeom prst="rect">
+                      <a:avLst/>
+                    </a:prstGeom>
+                    <a:noFill/>
+                  </pic:spPr>
+                </pic:pic>
+              </a:graphicData>
+            </a:graphic>
+          </wp:anchor>
+        </w:drawing>
+      </w:r>
+    </w:p>
+    <w:p>
+      <w:pPr>
+        <w:pStyle w:val="Style16"/>
+        <w:bidi w:val="0"/>
+        <w:ind w:hanging="0"/>
+        <w:jc w:val="center"/>
+        <w:rPr>
+          <w:b/>
+        </w:rPr>
+      </w:pPr>
+      <w:r>
+        <w:drawing>
+          <wp:anchor behindDoc="0" distT="0" distB="0" distL="0" distR="0" simplePos="0" locked="0" layoutInCell="0" allowOverlap="1" relativeHeight="7">
+            <wp:simplePos x="0" y="0"/>
+            <wp:positionH relativeFrom="column">
+              <wp:align>center</wp:align>
+            </wp:positionH>
+            <wp:positionV relativeFrom="paragraph">
+              <wp:posOffset>635</wp:posOffset>
+            </wp:positionV>
+            <wp:extent cx="5940425" cy="1743710"/>
+            <wp:effectExtent l="0" t="0" r="0" b="0"/>
+            <wp:wrapTopAndBottom/>
+            <wp:docPr id="6" name="Изображение6" descr="" title=""/>
+            <wp:cNvGraphicFramePr>
+              <a:graphicFrameLocks xmlns:a="http://schemas.openxmlformats.org/drawingml/2006/main" noChangeAspect="1"/>
+            </wp:cNvGraphicFramePr>
+            <a:graphic xmlns:a="http://schemas.openxmlformats.org/drawingml/2006/main">
+              <a:graphicData uri="http://schemas.openxmlformats.org/drawingml/2006/picture">
+                <pic:pic xmlns:pic="http://schemas.openxmlformats.org/drawingml/2006/picture">
+                  <pic:nvPicPr>
+                    <pic:cNvPr id="6" name="Изображение6" descr="" title=""/>
+                    <pic:cNvPicPr>
+                      <a:picLocks noChangeAspect="1" noChangeArrowheads="1"/>
+                    </pic:cNvPicPr>
+                  </pic:nvPicPr>
+                  <pic:blipFill>
+                    <a:blip r:embed="rId7"/>
+                    <a:stretch>
+                      <a:fillRect/>
+                    </a:stretch>
+                  </pic:blipFill>
+                  <pic:spPr bwMode="auto">
+                    <a:xfrm>
+                      <a:off x="0" y="0"/>
+                      <a:ext cx="5940425" cy="1743710"/>
+                    </a:xfrm>
+                    <a:prstGeom prst="rect">
+                      <a:avLst/>
+                    </a:prstGeom>
+                    <a:noFill/>
+                  </pic:spPr>
+                </pic:pic>
+              </a:graphicData>
+            </a:graphic>
+          </wp:anchor>
+        </w:drawing>
+      </w:r>
+      <w:r>
+        <w:rPr>
+          <w:b/>
+        </w:rPr>
+        <w:t>dd</w:t>
+      </w:r>
+    </w:p>
+    <w:p>
+      <w:pPr>
+        <w:pStyle w:val="Style16"/>
+        <w:bidi w:val="0"/>
+        <w:ind w:hanging="0"/>
+        <w:jc w:val="center"/>
+        <w:rPr>
+          <w:b/>
+        </w:rPr>
+      </w:pPr>
+      <w:r>
+        <w:rPr>
+          <w:b/>
+        </w:rPr>
+        <w:drawing>
+          <wp:anchor behindDoc="0" distT="0" distB="0" distL="0" distR="0" simplePos="0" locked="0" layoutInCell="0" allowOverlap="1" relativeHeight="8">
+            <wp:simplePos x="0" y="0"/>
+            <wp:positionH relativeFrom="column">
+              <wp:align>center</wp:align>
+            </wp:positionH>
+            <wp:positionV relativeFrom="paragraph">
+              <wp:posOffset>635</wp:posOffset>
+            </wp:positionV>
+            <wp:extent cx="5940425" cy="1965325"/>
+            <wp:effectExtent l="0" t="0" r="0" b="0"/>
+            <wp:wrapTopAndBottom/>
+            <wp:docPr id="7" name="Изображение7" descr="" title=""/>
+            <wp:cNvGraphicFramePr>
+              <a:graphicFrameLocks xmlns:a="http://schemas.openxmlformats.org/drawingml/2006/main" noChangeAspect="1"/>
+            </wp:cNvGraphicFramePr>
+            <a:graphic xmlns:a="http://schemas.openxmlformats.org/drawingml/2006/main">
+              <a:graphicData uri="http://schemas.openxmlformats.org/drawingml/2006/picture">
+                <pic:pic xmlns:pic="http://schemas.openxmlformats.org/drawingml/2006/picture">
+                  <pic:nvPicPr>
+                    <pic:cNvPr id="7" name="Изображение7" descr="" title=""/>
+                    <pic:cNvPicPr>
+                      <a:picLocks noChangeAspect="1" noChangeArrowheads="1"/>
+                    </pic:cNvPicPr>
+                  </pic:nvPicPr>
+                  <pic:blipFill>
+                    <a:blip r:embed="rId8"/>
+                    <a:stretch>
+                      <a:fillRect/>
+                    </a:stretch>
+                  </pic:blipFill>
+                  <pic:spPr bwMode="auto">
+                    <a:xfrm>
+                      <a:off x="0" y="0"/>
+                      <a:ext cx="5940425" cy="1965325"/>
+                    </a:xfrm>
+                    <a:prstGeom prst="rect">
+                      <a:avLst/>
+                    </a:prstGeom>
+                    <a:noFill/>
+                  </pic:spPr>
+                </pic:pic>
+              </a:graphicData>
+            </a:graphic>
+          </wp:anchor>
+        </w:drawing>
       </w:r>
     </w:p>
     <w:p>
@@ -1135,9 +1354,9 @@
       </w:r>
     </w:p>
     <w:sectPr>
-      <w:footerReference w:type="even" r:id="rId5"/>
-      <w:footerReference w:type="default" r:id="rId6"/>
-      <w:footerReference w:type="first" r:id="rId7"/>
+      <w:footerReference w:type="even" r:id="rId9"/>
+      <w:footerReference w:type="default" r:id="rId10"/>
+      <w:footerReference w:type="first" r:id="rId11"/>
       <w:type w:val="nextPage"/>
       <w:pgSz w:w="11906" w:h="16838"/>
       <w:pgMar w:left="1701" w:right="850" w:gutter="0" w:header="0" w:top="1134" w:footer="708" w:bottom="1134"/>
@@ -1216,7 +1435,7 @@
             <w:szCs w:val="24"/>
             <w:rFonts w:cs="Times New Roman" w:ascii="Times New Roman" w:hAnsi="Times New Roman"/>
           </w:rPr>
-          <w:t>3</w:t>
+          <w:t>4</w:t>
         </w:r>
         <w:r>
           <w:rPr>
@@ -1295,7 +1514,7 @@
             <w:szCs w:val="24"/>
             <w:rFonts w:cs="Times New Roman" w:ascii="Times New Roman" w:hAnsi="Times New Roman"/>
           </w:rPr>
-          <w:t>3</w:t>
+          <w:t>4</w:t>
         </w:r>
         <w:r>
           <w:rPr>

</xml_diff>